<commit_message>
Keep what a blank-looking line draws at a page's foot, line up tabs a round at a time, take a tab that ends its line to its stop, number a footnote in a repeated header row once, keep header rows taller than a page from repeating, and print a page whose footer fills its margin on one sheet
</commit_message>
<xml_diff>
--- a/tests/fixtures/files/word-measured-fit.docx
+++ b/tests/fixtures/files/word-measured-fit.docx
@@ -802,6 +802,20 @@
     </w:p>
     <w:p>
       <w:pPr>
+        <w:tabs>
+          <w:tab w:pos="8640" w:val="right" w:leader="dot"/>
+        </w:tabs>
+        <w:ind w:firstLine="0"/>
+      </w:pPr>
+      <w:r>
+        <w:t>Contents line ending on its tab</w:t>
+      </w:r>
+      <w:r>
+        <w:tab/>
+      </w:r>
+    </w:p>
+    <w:p>
+      <w:pPr>
         <w:spacing w:lineRule="exact" w:line="480"/>
         <w:ind w:firstLine="0"/>
       </w:pPr>

</xml_diff>